<commit_message>
v9: crosscheck corrections (dxyz fee, cclfx benchmark disclaimer) + memo regen
</commit_message>
<xml_diff>
--- a/data/memos/breit_decision_memo.docx
+++ b/data/memos/breit_decision_memo.docx
@@ -23,7 +23,7 @@
         <w:br/>
       </w:r>
       <w:r>
-        <w:t>Date: 2026-07-18    Status: DRAFT — demo build; cells marked extracted-unverified pend independent verification.</w:t>
+        <w:t>Date: 2026-08-09    Status: DRAFT — demo build; cells marked extracted-unverified pend independent verification.</w:t>
       </w:r>
     </w:p>
     <w:p>
@@ -132,7 +132,7 @@
               <w:br/>
               <w:t>2.2: Performance participation w/ hurdle + high-water mechanics - AND a live miss: FY2024 total return did not exceed the hurdle, producing a $105.0M Quarterly Shortfall; from 1/1/2025 the 2024 Shortfall Obligation accrues 5%</w:t>
               <w:br/>
-              <w:t>2.7: PARTIAL: Early Repurchase Deduction EXISTS (excluded from the 2%/5% cap math); rate pending targeted read.</w:t>
+              <w:t>2.7: Early Repurchase Deduction: shares held less than one year are repurchased at 98% of the transaction price, i.e. a 2% deduction, subject to limited exceptions. Does NOT apply to shares acquired through the distribution r</w:t>
             </w:r>
           </w:p>
         </w:tc>
@@ -156,9 +156,11 @@
             <w:r>
               <w:t>3.1: Repurchase caps: 2% of aggregate NAV per MONTH, 5% per QUARTER (measured on prior-period NAV; Early Repurchase Deduction excluded). Board may modify/suspend if requests burden liquidity.</w:t>
               <w:br/>
-              <w:t>3.3: CONFIRMED in issuer's own words: repurchase requests have exceeded plan limits in the past; shares repurchased pro rata; 'periods of prorated fulfillment' acknowledged (the 2022-24 gating). Monthly request-vs-fulfilled t</w:t>
+              <w:t>3.3: Quantified from FY2025 10-K: common stock repurchased FY2023 $12.42B -&gt; FY2024 $9.31B -&gt; FY2025 $6.13B (cash-flow statement $000s: 12,419,310 / 9,307,418 / 6,132,773) - a declining exit wave. FY2025 fulfilled $6.2B = ALL</w:t>
               <w:br/>
               <w:t>3.6: Charter leverage limit: borrowing capped at 300% of cost of net assets (approx 75% of cost of investments) absent independent-director override with disclosure.</w:t>
+              <w:br/>
+              <w:t>3.7: Plan-side demand profile (Form 5500 PY2024): 1,847 separated-with-balances = 36.1% of 5,120 accounts - the near-term liquidity tail; 3,281 active; zero retirees in pay status; 404(c) fully participant-directed.</w:t>
             </w:r>
           </w:p>
         </w:tc>
@@ -180,7 +182,7 @@
           </w:tcPr>
           <w:p>
             <w:r>
-              <w:t>4.4: Appraisal assumptions by property type (12/31/2025): Rental Housing 7.2% discount / 5.4% exit cap; Industrial 7.5% / 5.5%; Net Lease 6.6% / (further rows in table). Cell 4.4's richest disclosure on the roster.</w:t>
+              <w:t>4.4: COMPLETE weighted-average DCF assumptions by property type (12/31/2025): Rental Housing 7.2% discount / 5.4% exit cap; Industrial 7.5% / 5.5%; Net Lease 6.6% / 5.6%; Hospitality 10.8% / 9.0%; Data Centers 8.3% / 6.1%; Se</w:t>
               <w:br/>
               <w:t>4.5: Deloitte &amp; Touche LLP, New York; auditor since 2016 (Big-4).</w:t>
             </w:r>
@@ -226,7 +228,7 @@
           </w:tcPr>
           <w:p>
             <w:r>
-              <w:t>No cells evaluated yet — pending extraction.</w:t>
+              <w:t>6.4: PARTIAL: investor tax form NOT named in on-disk filings - searched 10-K 2026-02-27 and 10-Q 2026-08-07 for '1099'/'K-1'/'Schedule K': only XBRL context-id artifacts, no Form 1099 text. What IS printed: REIT election effe</w:t>
             </w:r>
           </w:p>
         </w:tc>
@@ -255,7 +257,7 @@
     </w:p>
     <w:p>
       <w:r>
-        <w:t>Every populated cell carries its source document, section, quote, extractor and verifier in data/evidence/. Current cell status for this product: extracted: 6, n/a: 10, partial: 3, pending: 35. Cells marked extracted-unverified or computed await independent verification; verified cells have been independently re-checked.</w:t>
+        <w:t>Every populated cell carries its source document, section, quote, extractor and verifier in data/evidence/. Current cell status for this product: computed: 2, extracted: 7, n/a: 8, partial: 3, pending: 34. Cells marked extracted-unverified or computed await independent verification; verified cells have been independently re-checked.</w:t>
       </w:r>
     </w:p>
     <w:p>

</xml_diff>

<commit_message>
coverage max-out COMPLETE: 0 unresolved cells (324/324) - breit printed monthly NAV series (rho 0.483, heavy smoothing), kkr/breit benchmark selections (PME 0.90/0.91 vs listed proxies), engine daily-anchoring correction (cclfx 1.2519 -> 1.2532, breit index display fixed), series_annual for all six, memos regenerated
Co-Authored-By: Claude Fable 5 <noreply@anthropic.com>
</commit_message>
<xml_diff>
--- a/data/memos/breit_decision_memo.docx
+++ b/data/memos/breit_decision_memo.docx
@@ -106,7 +106,13 @@
           </w:tcPr>
           <w:p>
             <w:r>
-              <w:t>1.4: PARTIAL: $2.4B monthly net distributions declared FY2025; avg annualized distribution rate by class (I 4.8%, S 3.9%, D 4.6%, T 4.0%). ROC split pending.</w:t>
+              <w:t>1.1: FULL printed monthly NAV/share series, Class I, Jan 2023 - Dec 2025 (36 points) + Jun 2026 from the 10-Q - structured at data/series_monthly/breit_nav.csv (adversarially verified vs raw HTML; Jan-May 2026 not printed any</w:t>
+              <w:br/>
+              <w:t>1.2: FY2025 10-K '2025 Highlights' table (classes in order I | S | S-2 | D | D-2 | T | T-2): Year-to-Date (2025) Total Return, without upfront selling commissions: 8.1% | 7.2% | 3.2% | 7.8% | 3.1% | 7.2% | 3.4%; assuming maxi</w:t>
+              <w:br/>
+              <w:t>1.4: EXTENSION (tax character + per-class detail, FY2025 10-K): Distributions for the year ended December 31, 2025 were characterized for federal income tax purposes as 100% return of capital (0% ordinary income, 0% capital g</w:t>
+              <w:br/>
+              <w:t>1.5: BREIT owns real estate directly (wholly owned and via JVs) - there are no underlying GP funds, so no underlying fund IRR table exists in the filings. Closest printed sleeve-level performance (FY2025 10-K, Same Property N</w:t>
             </w:r>
           </w:p>
         </w:tc>
@@ -132,7 +138,9 @@
               <w:br/>
               <w:t>2.2: Performance participation w/ hurdle + high-water mechanics - AND a live miss: FY2024 total return did not exceed the hurdle, producing a $105.0M Quarterly Shortfall; from 1/1/2025 the 2024 Shortfall Obligation accrues 5%</w:t>
               <w:br/>
-              <w:t>2.7: Early Repurchase Deduction: shares held less than one year are repurchased at 98% of the transaction price, i.e. a 2% deduction, subject to limited exceptions. Does NOT apply to shares acquired through the distribution r</w:t>
+              <w:t>2.4: Not applicable — none exists: BREIT is a 10-K filer (non-'40-Act REIT) with no 1940-Act-style fee table; no 'Acquired Fund Fees and Expenses' line exists and none can (AFFE is a 1940-Act registered-fund disclosure). Sear</w:t>
+              <w:br/>
+              <w:t>2.6: As of December 31, 2025 (Item 5 table): selling commissions and dealer manager fees (% of transaction price) up to 3.5% for Class S, S-2, T, T-2; up to 1.5% for Class D, D-2. Stockholder servicing fee (% of NAV): 0.85% f</w:t>
             </w:r>
           </w:p>
         </w:tc>
@@ -156,11 +164,11 @@
             <w:r>
               <w:t>3.1: Repurchase caps: 2% of aggregate NAV per MONTH, 5% per QUARTER (measured on prior-period NAV; Early Repurchase Deduction excluded). Board may modify/suspend if requests burden liquidity.</w:t>
               <w:br/>
+              <w:t>3.2: Mechanics as printed in FY2025 10-K (Item 5 - Share Repurchases; repeated in Note 14): CADENCE/PRICING DATE - repurchases only as of the opening of the last calendar day of each month (the 'Repurchase Date'); price = tra</w:t>
+              <w:br/>
               <w:t>3.3: Quantified from FY2025 10-K: common stock repurchased FY2023 $12.42B -&gt; FY2024 $9.31B -&gt; FY2025 $6.13B (cash-flow statement $000s: 12,419,310 / 9,307,418 / 6,132,773) - a declining exit wave. FY2025 fulfilled $6.2B = ALL</w:t>
               <w:br/>
-              <w:t>3.6: Charter leverage limit: borrowing capped at 300% of cost of net assets (approx 75% of cost of investments) absent independent-director override with disclosure.</w:t>
-              <w:br/>
-              <w:t>3.7: Plan-side demand profile (Form 5500 PY2024): 1,847 separated-with-balances = 36.1% of 5,120 accounts - the near-term liquidity tail; 3,281 active; zero retirees in pay status; 404(c) fully participant-directed.</w:t>
+              <w:t>3.4: Liquidity of $6.7 billion as of February 26, 2026: $5.6 billion available under undrawn revolving credit facilities plus $1.1 billion unrestricted cash and cash equivalents; also $0.2 billion expected disposition proceed</w:t>
             </w:r>
           </w:p>
         </w:tc>
@@ -182,9 +190,13 @@
           </w:tcPr>
           <w:p>
             <w:r>
+              <w:t>4.1: NAV frequency: monthly — 'We calculate and publish NAV monthly' solely for establishing monthly sale/repurchase price. Who values: the Adviser (BX REIT Advisors L.L.C.) calculates fair value of real estate properties mon</w:t>
+              <w:br/>
+              <w:t>4.2: Recurring fair-value table ($K). December 31, 2025 - ASSETS: Investments in real estate debt L1 $0 / L2 $3,282,457 / L3 $754,693 / total $4,037,150; Real estate loans held by consolidated securitization vehicles L2 $6,97</w:t>
+              <w:br/>
+              <w:t>4.3: PARTIAL: the 10-K repeatedly references 'an independent valuation advisor' that reviews monthly property valuations and monthly/quarterly real estate debt valuations for reasonableness (and reviews Adviser valuation assu</w:t>
+              <w:br/>
               <w:t>4.4: COMPLETE weighted-average DCF assumptions by property type (12/31/2025): Rental Housing 7.2% discount / 5.4% exit cap; Industrial 7.5% / 5.5%; Net Lease 6.6% / 5.6%; Hospitality 10.8% / 9.0%; Data Centers 8.3% / 6.1%; Se</w:t>
-              <w:br/>
-              <w:t>4.5: Deloitte &amp; Touche LLP, New York; auditor since 2016 (Big-4).</w:t>
             </w:r>
           </w:p>
         </w:tc>
@@ -206,7 +218,13 @@
           </w:tcPr>
           <w:p>
             <w:r>
-              <w:t>No cells evaluated yet — pending extraction.</w:t>
+              <w:t>5.1: ABSENCE DOCUMENTED: BREIT declares NO benchmark index anywhere in the FY2025 10-K. Zero hits for MSCI, ODCE, or FTSE Nareit; NCREIF appears only as a geography taxonomy ('Region Concentration represents regions as define</w:t>
+              <w:br/>
+              <w:t xml:space="preserve">5.3: Alt-index candidates evaluated: NCREIF ODCE (private core RE - strategy-exact, SECONDARY at 8/12; index data is member/subscription distribution, series not held); Cambridge Associates RE (7/12, outranked; licensed data </w:t>
+              <w:br/>
+              <w:t>5.4: Peer cohort (lane C): no second non-traded REIT in the six-product universe - peer candidate scored 5/12 (no computable series) and was rejected below threshold; documented in the rejection log. Market-wide non-traded-RE</w:t>
+              <w:br/>
+              <w:t>5.5: PME inputs (computed): window 2022-12-31 to 2025-12-31; flows [-1 at start, 1.0971 at end] built from PRINTED Class I calendar-year total returns (-0.5%, 2.0%, 8.1% - cells 1.2, three 10-Ks cited there); index VNQ adj-cl</w:t>
             </w:r>
           </w:p>
         </w:tc>
@@ -228,6 +246,12 @@
           </w:tcPr>
           <w:p>
             <w:r>
+              <w:t xml:space="preserve">6.1: Blackstone Real Estate Income Trust, Inc.: Maryland corporation incorporated November 16, 2015; non-listed, perpetual-life REIT (REIT election commencing taxable year ended December 31, 2017). UPREIT structure: BREIT is </w:t>
+              <w:br/>
+              <w:t>6.2: Strategy: invests primarily in stabilized, income-generating commercial real estate across asset classes in the U.S. (and to a lesser extent outside the U.S.), plus real estate debt to a lesser extent. Nine reportable se</w:t>
+              <w:br/>
+              <w:t>6.3: Note 10 'Related Party and Other Transactions' (FY2025): Due to affiliates $791,741K at Dec 31, 2025 (accrued stockholder servicing fee $724,771K; accrued management fee $56,818K; other $10,152K). Management fee 1.25% of</w:t>
+              <w:br/>
               <w:t>6.4: PARTIAL: investor tax form NOT named in on-disk filings - searched 10-K 2026-02-27 and 10-Q 2026-08-07 for '1099'/'K-1'/'Schedule K': only XBRL context-id artifacts, no Form 1099 text. What IS printed: REIT election effe</w:t>
             </w:r>
           </w:p>
@@ -243,10 +267,254 @@
       </w:r>
     </w:p>
     <w:p>
+      <w:pPr>
+        <w:pStyle w:val="Heading2"/>
+      </w:pPr>
       <w:r>
-        <w:t>Engine profile pending for this product — extraction depth required before selection.</w:t>
+        <w:t>Primary: Listed REIT investable proxy (VNQ) — score 9/12</w:t>
       </w:r>
     </w:p>
+    <w:p>
+      <w:r>
+        <w:t>Window 2022-12-31 to 2025-12-31: fund 3.14%/yr vs benchmark 6.57%/yr; KS-PME 0.9073; Direct Alpha -3.19%/yr. Disclosure: PME and alpha computed on appraisal-lagged NAVs are window-sensitive and can be smoothing-flattered; conclusions should be read with the methodology's window-sensitivity analysis.</w:t>
+      </w:r>
+    </w:p>
+    <w:p>
+      <w:pPr>
+        <w:pStyle w:val="ListBullet"/>
+      </w:pPr>
+      <w:r>
+        <w:t>strategy_match 2/3: listed equity REITs - same asset class, but exchange pricing vs monthly appraisal NAV is a regime difference</w:t>
+      </w:r>
+    </w:p>
+    <w:p>
+      <w:pPr>
+        <w:pStyle w:val="ListBullet"/>
+      </w:pPr>
+      <w:r>
+        <w:t>risk_liquidity_match 1/3: daily-liquid proxy vs semi-liquid fund - vol/liquidity regimes differ</w:t>
+      </w:r>
+    </w:p>
+    <w:p>
+      <w:pPr>
+        <w:pStyle w:val="ListBullet"/>
+      </w:pPr>
+      <w:r>
+        <w:t>investability 2/2: investable, priced daily</w:t>
+      </w:r>
+    </w:p>
+    <w:p>
+      <w:pPr>
+        <w:pStyle w:val="ListBullet"/>
+      </w:pPr>
+      <w:r>
+        <w:t>data_quality 2/2: daily series</w:t>
+      </w:r>
+    </w:p>
+    <w:p>
+      <w:pPr>
+        <w:pStyle w:val="ListBullet"/>
+      </w:pPr>
+      <w:r>
+        <w:t>provider_independence 2/2: provider unaffiliated with the fund</w:t>
+      </w:r>
+    </w:p>
+    <w:p>
+      <w:pPr>
+        <w:pStyle w:val="Heading2"/>
+      </w:pPr>
+      <w:r>
+        <w:t>Secondary: NCREIF Fund Index - ODCE (private core RE) — score 8/12</w:t>
+      </w:r>
+    </w:p>
+    <w:p>
+      <w:pPr>
+        <w:pStyle w:val="ListBullet"/>
+      </w:pPr>
+      <w:r>
+        <w:t>strategy_match 3/3: private open-end core RE funds - the strategy-exact yardstick; index data is member/subscription distribution, series not held</w:t>
+      </w:r>
+    </w:p>
+    <w:p>
+      <w:pPr>
+        <w:pStyle w:val="ListBullet"/>
+      </w:pPr>
+      <w:r>
+        <w:t>risk_liquidity_match 2/3: appraisal-cadence series, closer to the fund's NAV process</w:t>
+      </w:r>
+    </w:p>
+    <w:p>
+      <w:pPr>
+        <w:pStyle w:val="ListBullet"/>
+      </w:pPr>
+      <w:r>
+        <w:t>investability 0/2: not investable / not held</w:t>
+      </w:r>
+    </w:p>
+    <w:p>
+      <w:pPr>
+        <w:pStyle w:val="ListBullet"/>
+      </w:pPr>
+      <w:r>
+        <w:t>data_quality 1/2: quarterly-manual series</w:t>
+      </w:r>
+    </w:p>
+    <w:p>
+      <w:pPr>
+        <w:pStyle w:val="ListBullet"/>
+      </w:pPr>
+      <w:r>
+        <w:t>provider_independence 2/2: provider unaffiliated with the fund</w:t>
+      </w:r>
+    </w:p>
+    <w:p>
+      <w:pPr>
+        <w:pStyle w:val="Heading2"/>
+      </w:pPr>
+      <w:r>
+        <w:t>Rejection log (candidates considered and not selected)</w:t>
+      </w:r>
+    </w:p>
+    <w:tbl>
+      <w:tblPr>
+        <w:tblStyle w:val="TableGrid"/>
+        <w:tblW w:type="auto" w:w="0"/>
+        <w:tblLook w:firstColumn="1" w:firstRow="1" w:lastColumn="0" w:lastRow="0" w:noHBand="0" w:noVBand="1" w:val="04A0"/>
+      </w:tblPr>
+      <w:tblGrid>
+        <w:gridCol w:w="3120"/>
+        <w:gridCol w:w="3120"/>
+        <w:gridCol w:w="3120"/>
+      </w:tblGrid>
+      <w:tr>
+        <w:tc>
+          <w:tcPr>
+            <w:tcW w:type="dxa" w:w="3456"/>
+          </w:tcPr>
+          <w:p>
+            <w:r>
+              <w:t>Candidate</w:t>
+            </w:r>
+          </w:p>
+        </w:tc>
+        <w:tc>
+          <w:tcPr>
+            <w:tcW w:type="dxa" w:w="1152"/>
+          </w:tcPr>
+          <w:p>
+            <w:r>
+              <w:t>Score</w:t>
+            </w:r>
+          </w:p>
+        </w:tc>
+        <w:tc>
+          <w:tcPr>
+            <w:tcW w:type="dxa" w:w="4752"/>
+          </w:tcPr>
+          <w:p>
+            <w:r>
+              <w:t>Reason</w:t>
+            </w:r>
+          </w:p>
+        </w:tc>
+      </w:tr>
+      <w:tr>
+        <w:tc>
+          <w:tcPr>
+            <w:tcW w:type="dxa" w:w="3456"/>
+          </w:tcPr>
+          <w:p>
+            <w:r>
+              <w:t>PME / Direct Alpha vs VNQ</w:t>
+            </w:r>
+          </w:p>
+        </w:tc>
+        <w:tc>
+          <w:tcPr>
+            <w:tcW w:type="dxa" w:w="1152"/>
+          </w:tcPr>
+          <w:p>
+            <w:r>
+              <w:t>8/12</w:t>
+            </w:r>
+          </w:p>
+        </w:tc>
+        <w:tc>
+          <w:tcPr>
+            <w:tcW w:type="dxa" w:w="4752"/>
+          </w:tcPr>
+          <w:p>
+            <w:r>
+              <w:t>outranked: score 8/12 vs primary 9/12 and secondary 8/12 - only two slots; retained in log as viable alternate</w:t>
+            </w:r>
+          </w:p>
+        </w:tc>
+      </w:tr>
+      <w:tr>
+        <w:tc>
+          <w:tcPr>
+            <w:tcW w:type="dxa" w:w="3456"/>
+          </w:tcPr>
+          <w:p>
+            <w:r>
+              <w:t>Cambridge Associates Real Estate benchmark</w:t>
+            </w:r>
+          </w:p>
+        </w:tc>
+        <w:tc>
+          <w:tcPr>
+            <w:tcW w:type="dxa" w:w="1152"/>
+          </w:tcPr>
+          <w:p>
+            <w:r>
+              <w:t>7/12</w:t>
+            </w:r>
+          </w:p>
+        </w:tc>
+        <w:tc>
+          <w:tcPr>
+            <w:tcW w:type="dxa" w:w="4752"/>
+          </w:tcPr>
+          <w:p>
+            <w:r>
+              <w:t>outranked: score 7/12 vs primary 9/12 and secondary 8/12 - only two slots; retained in log as viable alternate</w:t>
+            </w:r>
+          </w:p>
+        </w:tc>
+      </w:tr>
+      <w:tr>
+        <w:tc>
+          <w:tcPr>
+            <w:tcW w:type="dxa" w:w="3456"/>
+          </w:tcPr>
+          <w:p>
+            <w:r>
+              <w:t>Peer cohort: non-traded REITs in universe</w:t>
+            </w:r>
+          </w:p>
+        </w:tc>
+        <w:tc>
+          <w:tcPr>
+            <w:tcW w:type="dxa" w:w="1152"/>
+          </w:tcPr>
+          <w:p>
+            <w:r>
+              <w:t>5/12</w:t>
+            </w:r>
+          </w:p>
+        </w:tc>
+        <w:tc>
+          <w:tcPr>
+            <w:tcW w:type="dxa" w:w="4752"/>
+          </w:tcPr>
+          <w:p>
+            <w:r>
+              <w:t>score 5/12 below primary threshold 7</w:t>
+            </w:r>
+          </w:p>
+        </w:tc>
+      </w:tr>
+    </w:tbl>
     <w:p>
       <w:pPr>
         <w:pStyle w:val="Heading1"/>
@@ -257,7 +525,7 @@
     </w:p>
     <w:p>
       <w:r>
-        <w:t>Every populated cell carries its source document, section, quote, extractor and verifier in data/evidence/. Current cell status for this product: computed: 2, extracted: 7, n/a: 8, partial: 3, pending: 34. Cells marked extracted-unverified or computed await independent verification; verified cells have been independently re-checked.</w:t>
+        <w:t>Every populated cell carries its source document, section, quote, extractor and verifier in data/evidence/. Current cell status for this product: computed: 11, extracted: 20, fetched: 1, n/a: 15, partial: 7. Cells marked extracted-unverified or computed await independent verification; verified cells have been independently re-checked.</w:t>
       </w:r>
     </w:p>
     <w:p>

</xml_diff>